<commit_message>
all latest documents checked in
</commit_message>
<xml_diff>
--- a/FINAL-SUBMISSION-2026/Ram-Kotni-AI-Engineer.docx
+++ b/FINAL-SUBMISSION-2026/Ram-Kotni-AI-Engineer.docx
@@ -60,7 +60,7 @@
         </w:rPr>
       </w:pPr>
       <w:r>
-        <w:t>AI Engineer </w:t>
+        <w:t xml:space="preserve">AI Engineer </w:t>
       </w:r>
     </w:p>
     <w:p>
@@ -317,9 +317,116 @@
       </w:pPr>
       <w:r>
         <w:rPr>
+          <w:rStyle w:val="contentcontrolboundarysink"/>
+          <w:rFonts w:ascii="Arial" w:hAnsi="Arial" w:cs="Arial"/>
+          <w:b/>
+          <w:bCs/>
+          <w:color w:val="000000" w:themeColor="text1"/>
+          <w:sz w:val="20"/>
+          <w:szCs w:val="20"/>
+        </w:rPr>
+      </w:r>
+      <w:r>
+        <w:rPr>
+          <w:rStyle w:val="normaltextrun"/>
+          <w:rFonts w:asciiTheme="minorHAnsi" w:eastAsiaTheme="minorEastAsia" w:hAnsiTheme="minorHAnsi" w:cstheme="minorBidi"/>
+          <w:color w:val="000000" w:themeColor="text1"/>
+          <w:sz w:val="20"/>
+          <w:szCs w:val="20"/>
+        </w:rPr>
+      </w:r>
+      <w:r>
+        <w:rPr>
+          <w:rFonts w:ascii="Verdana" w:hAnsi="Verdana" w:cs="Arial"/>
+          <w:color w:val="000000" w:themeColor="text1"/>
+          <w:sz w:val="20"/>
+          <w:szCs w:val="20"/>
+        </w:rPr>
+      </w:r>
+      <w:r>
+        <w:rPr>
+          <w:rFonts w:ascii="Verdana" w:hAnsi="Verdana" w:cs="Arial"/>
+          <w:b/>
+          <w:bCs/>
+          <w:color w:val="000000" w:themeColor="text1"/>
+          <w:sz w:val="20"/>
+          <w:szCs w:val="20"/>
+        </w:rPr>
+      </w:r>
+      <w:r>
+        <w:rPr>
+          <w:rFonts w:ascii="Verdana" w:hAnsi="Verdana" w:cs="Arial"/>
+          <w:color w:val="000000" w:themeColor="text1"/>
+          <w:sz w:val="20"/>
+          <w:szCs w:val="20"/>
+        </w:rPr>
+      </w:r>
+      <w:r>
+        <w:rPr>
+          <w:rFonts w:ascii="Verdana" w:hAnsi="Verdana" w:cs="Arial"/>
+          <w:b/>
+          <w:bCs/>
+          <w:color w:val="000000" w:themeColor="text1"/>
+          <w:sz w:val="20"/>
+          <w:szCs w:val="20"/>
+        </w:rPr>
+      </w:r>
+      <w:r>
+        <w:rPr>
+          <w:rFonts w:ascii="Verdana" w:hAnsi="Verdana" w:cs="Arial"/>
+          <w:b/>
+          <w:bCs/>
+          <w:color w:val="000000" w:themeColor="text1"/>
+          <w:sz w:val="20"/>
+          <w:szCs w:val="20"/>
+        </w:rPr>
+      </w:r>
+      <w:r>
+        <w:rPr>
+          <w:rFonts w:ascii="Verdana" w:hAnsi="Verdana" w:cs="Arial"/>
+          <w:color w:val="000000" w:themeColor="text1"/>
+          <w:sz w:val="20"/>
+          <w:szCs w:val="20"/>
+        </w:rPr>
+      </w:r>
+      <w:r>
+        <w:rPr>
+          <w:rFonts w:ascii="Verdana" w:hAnsi="Verdana" w:cs="Arial"/>
+          <w:b/>
+          <w:bCs/>
+          <w:color w:val="000000" w:themeColor="text1"/>
+          <w:sz w:val="20"/>
+          <w:szCs w:val="20"/>
+        </w:rPr>
+      </w:r>
+      <w:r>
+        <w:rPr>
+          <w:rFonts w:ascii="Verdana" w:hAnsi="Verdana" w:cs="Arial"/>
+          <w:color w:val="000000" w:themeColor="text1"/>
+          <w:sz w:val="20"/>
+          <w:szCs w:val="20"/>
+        </w:rPr>
+      </w:r>
+      <w:r>
+        <w:rPr>
+          <w:rFonts w:ascii="Verdana" w:hAnsi="Verdana" w:cs="Arial"/>
+          <w:color w:val="000000" w:themeColor="text1"/>
+          <w:sz w:val="20"/>
+          <w:szCs w:val="20"/>
+        </w:rPr>
+      </w:r>
+      <w:r>
+        <w:rPr>
+          <w:b/>
           <w:color w:val="000000"/>
           <w:sz w:val="20"/>
         </w:rPr>
+      </w:r>
+      <w:r>
+        <w:rPr>
+          <w:color w:val="000000"/>
+          <w:sz w:val="20"/>
+        </w:rPr>
         <w:t xml:space="preserve">To obtain a challenging </w:t>
       </w:r>
       <w:r>
@@ -358,25 +465,7 @@
           <w:color w:val="000000"/>
           <w:sz w:val="20"/>
         </w:rPr>
-        <w:t xml:space="preserve">Agentic AI, LLMs, GitHub Copilot, </w:t>
-      </w:r>
-      <w:proofErr w:type="spellStart"/>
-      <w:r>
-        <w:rPr>
-          <w:b/>
-          <w:color w:val="000000"/>
-          <w:sz w:val="20"/>
-        </w:rPr>
-        <w:t>APScheduler</w:t>
-      </w:r>
-      <w:proofErr w:type="spellEnd"/>
-      <w:r>
-        <w:rPr>
-          <w:b/>
-          <w:color w:val="000000"/>
-          <w:sz w:val="20"/>
-        </w:rPr>
-        <w:t>, and pandas</w:t>
+        <w:t>Agentic AI, LLMs, GitHub Copilot, APScheduler, and pandas</w:t>
       </w:r>
       <w:r>
         <w:rPr>
@@ -524,6 +613,32 @@
       </w:pPr>
       <w:r>
         <w:rPr>
+          <w:rFonts w:ascii="Verdana" w:hAnsi="Verdana" w:cs="Arial"/>
+          <w:b/>
+          <w:bCs/>
+          <w:color w:val="000000" w:themeColor="text1"/>
+          <w:sz w:val="20"/>
+          <w:szCs w:val="20"/>
+        </w:rPr>
+      </w:r>
+      <w:r>
+        <w:rPr>
+          <w:rFonts w:ascii="Verdana" w:hAnsi="Verdana" w:cs="Arial"/>
+          <w:color w:val="000000" w:themeColor="text1"/>
+          <w:sz w:val="20"/>
+          <w:szCs w:val="20"/>
+        </w:rPr>
+      </w:r>
+      <w:r>
+        <w:rPr>
+          <w:rFonts w:ascii="Verdana" w:hAnsi="Verdana" w:cs="Arial"/>
+          <w:color w:val="000000" w:themeColor="text1"/>
+          <w:sz w:val="20"/>
+          <w:szCs w:val="20"/>
+        </w:rPr>
+      </w:r>
+      <w:r>
+        <w:rPr>
           <w:b/>
           <w:color w:val="000000"/>
           <w:sz w:val="20"/>
@@ -543,25 +658,100 @@
           <w:color w:val="000000"/>
           <w:sz w:val="20"/>
         </w:rPr>
-        <w:t xml:space="preserve">GitHub Copilot, </w:t>
-      </w:r>
-      <w:proofErr w:type="spellStart"/>
+        <w:t>GitHub Copilot, APScheduler, pandas, and Oracle AI.</w:t>
+      </w:r>
+    </w:p>
+    <w:p>
+      <w:pPr>
+        <w:pStyle w:val="paragraph"/>
+        <w:numPr>
+          <w:ilvl w:val="0"/>
+          <w:numId w:val="9"/>
+        </w:numPr>
+        <w:spacing w:before="0" w:beforeAutospacing="0" w:after="0" w:afterAutospacing="0"/>
+        <w:rPr>
+          <w:rFonts w:ascii="Verdana" w:hAnsi="Verdana" w:cs="Arial"/>
+          <w:color w:val="000000" w:themeColor="text1"/>
+          <w:sz w:val="20"/>
+          <w:szCs w:val="20"/>
+        </w:rPr>
+      </w:pPr>
+      <w:r>
+        <w:rPr>
+          <w:rFonts w:ascii="Verdana" w:hAnsi="Verdana" w:cs="Arial"/>
+          <w:b/>
+          <w:bCs/>
+          <w:color w:val="000000" w:themeColor="text1"/>
+          <w:sz w:val="20"/>
+          <w:szCs w:val="20"/>
+        </w:rPr>
+        <w:t>Core strengths</w:t>
+      </w:r>
+      <w:r>
+        <w:rPr>
+          <w:rFonts w:ascii="Verdana" w:hAnsi="Verdana" w:cs="Arial"/>
+          <w:color w:val="000000" w:themeColor="text1"/>
+          <w:sz w:val="20"/>
+          <w:szCs w:val="20"/>
+        </w:rPr>
+        <w:t xml:space="preserve">: </w:t>
+      </w:r>
+    </w:p>
+    <w:p>
+      <w:pPr>
+        <w:pStyle w:val="paragraph"/>
+        <w:numPr>
+          <w:ilvl w:val="0"/>
+          <w:numId w:val="9"/>
+        </w:numPr>
+        <w:spacing w:before="0" w:beforeAutospacing="0" w:after="0" w:afterAutospacing="0"/>
+        <w:rPr>
+          <w:rFonts w:ascii="Verdana" w:hAnsi="Verdana" w:cs="Arial"/>
+          <w:color w:val="000000" w:themeColor="text1"/>
+          <w:sz w:val="20"/>
+          <w:szCs w:val="20"/>
+        </w:rPr>
+      </w:pPr>
+      <w:r>
+        <w:rPr>
+          <w:rFonts w:ascii="Verdana" w:hAnsi="Verdana" w:cs="Arial"/>
+          <w:b/>
+          <w:bCs/>
+          <w:color w:val="000000" w:themeColor="text1"/>
+          <w:sz w:val="20"/>
+          <w:szCs w:val="20"/>
+        </w:rPr>
+      </w:r>
+      <w:r>
+        <w:rPr>
+          <w:rFonts w:ascii="Verdana" w:hAnsi="Verdana" w:cs="Arial"/>
+          <w:color w:val="000000" w:themeColor="text1"/>
+          <w:sz w:val="20"/>
+          <w:szCs w:val="20"/>
+        </w:rPr>
+      </w:r>
+      <w:r>
+        <w:rPr>
+          <w:rFonts w:ascii="Verdana" w:hAnsi="Verdana" w:cs="Arial"/>
+          <w:color w:val="000000" w:themeColor="text1"/>
+          <w:sz w:val="20"/>
+          <w:szCs w:val="20"/>
+        </w:rPr>
+      </w:r>
       <w:r>
         <w:rPr>
           <w:b/>
           <w:color w:val="000000"/>
           <w:sz w:val="20"/>
         </w:rPr>
-        <w:t>APScheduler</w:t>
-      </w:r>
-      <w:proofErr w:type="spellEnd"/>
-      <w:r>
-        <w:rPr>
-          <w:b/>
+        <w:t>Backend (60%):</w:t>
+      </w:r>
+      <w:r>
+        <w:rPr>
           <w:color w:val="000000"/>
           <w:sz w:val="20"/>
         </w:rPr>
-        <w:t>, pandas, and Oracle AI.</w:t>
+        <w:t xml:space="preserve"> Java 17+, JAX-RS, Spring Boot, Microservices, RESTful API design, JPA/Hibernate, secure coding.</w:t>
       </w:r>
     </w:p>
     <w:p>
@@ -588,7 +778,6 @@
           <w:sz w:val="20"/>
           <w:szCs w:val="20"/>
         </w:rPr>
-        <w:t>Core strengths</w:t>
       </w:r>
       <w:r>
         <w:rPr>
@@ -597,7 +786,29 @@
           <w:sz w:val="20"/>
           <w:szCs w:val="20"/>
         </w:rPr>
-        <w:t xml:space="preserve">: </w:t>
+      </w:r>
+      <w:r>
+        <w:rPr>
+          <w:rFonts w:ascii="Verdana" w:hAnsi="Verdana" w:cs="Arial"/>
+          <w:color w:val="000000" w:themeColor="text1"/>
+          <w:sz w:val="20"/>
+          <w:szCs w:val="20"/>
+        </w:rPr>
+      </w:r>
+      <w:r>
+        <w:rPr>
+          <w:b/>
+          <w:color w:val="000000"/>
+          <w:sz w:val="20"/>
+        </w:rPr>
+        <w:t>AI &amp; Automation (25%):</w:t>
+      </w:r>
+      <w:r>
+        <w:rPr>
+          <w:color w:val="000000"/>
+          <w:sz w:val="20"/>
+        </w:rPr>
+        <w:t xml:space="preserve"> GitHub Copilot, Agentic AI, APScheduler, pandas, LangChain, OpenAI API, Plan-driven development.</w:t>
       </w:r>
     </w:p>
     <w:p>
@@ -617,18 +828,51 @@
       </w:pPr>
       <w:r>
         <w:rPr>
+          <w:rFonts w:ascii="Verdana" w:hAnsi="Verdana" w:cs="Arial"/>
+          <w:color w:val="000000" w:themeColor="text1"/>
+          <w:sz w:val="20"/>
+          <w:szCs w:val="20"/>
+        </w:rPr>
+        <w:t>Cloud &amp; DevOps: AWS, GCP, Kubernetes, Docker; CI/CD with Jenkins, GitHub Actions, Ansible.</w:t>
+      </w:r>
+    </w:p>
+    <w:p>
+      <w:pPr>
+        <w:pStyle w:val="paragraph"/>
+        <w:numPr>
+          <w:ilvl w:val="0"/>
+          <w:numId w:val="9"/>
+        </w:numPr>
+        <w:spacing w:before="0" w:beforeAutospacing="0" w:after="0" w:afterAutospacing="0"/>
+        <w:rPr>
+          <w:rFonts w:ascii="Verdana" w:hAnsi="Verdana" w:cs="Arial"/>
+          <w:color w:val="000000" w:themeColor="text1"/>
+          <w:sz w:val="20"/>
+          <w:szCs w:val="20"/>
+        </w:rPr>
+      </w:pPr>
+      <w:r>
+        <w:rPr>
+          <w:rFonts w:ascii="Verdana" w:hAnsi="Verdana" w:cs="Arial"/>
+          <w:color w:val="000000" w:themeColor="text1"/>
+          <w:sz w:val="20"/>
+          <w:szCs w:val="20"/>
+        </w:rPr>
+      </w:r>
+      <w:r>
+        <w:rPr>
           <w:b/>
           <w:color w:val="000000"/>
           <w:sz w:val="20"/>
         </w:rPr>
-        <w:t>Backend (60%):</w:t>
+        <w:t>Data &amp; Delivery:</w:t>
       </w:r>
       <w:r>
         <w:rPr>
           <w:color w:val="000000"/>
           <w:sz w:val="20"/>
         </w:rPr>
-        <w:t xml:space="preserve"> Java 17+, JAX-RS, Spring Boot, Microservices, RESTful API design, JPA/Hibernate, secure coding.</w:t>
+        <w:t xml:space="preserve"> Oracle, PostgreSQL, MongoDB; Kafka/RabbitMQ; Agile/Scrum, cross-functional collaboration.</w:t>
       </w:r>
     </w:p>
     <w:p>
@@ -648,153 +892,42 @@
       </w:pPr>
       <w:r>
         <w:rPr>
+          <w:rFonts w:ascii="Verdana" w:hAnsi="Verdana" w:cs="Arial"/>
+          <w:color w:val="000000" w:themeColor="text1"/>
+          <w:sz w:val="20"/>
+          <w:szCs w:val="20"/>
+        </w:rPr>
+      </w:r>
+      <w:r>
+        <w:rPr>
+          <w:rFonts w:ascii="Verdana" w:hAnsi="Verdana" w:cs="Arial"/>
+          <w:color w:val="000000" w:themeColor="text1"/>
+          <w:sz w:val="20"/>
+          <w:szCs w:val="20"/>
+        </w:rPr>
+      </w:r>
+      <w:r>
+        <w:rPr>
+          <w:rFonts w:ascii="Verdana" w:hAnsi="Verdana" w:cs="Arial"/>
+          <w:color w:val="000000" w:themeColor="text1"/>
+          <w:sz w:val="20"/>
+          <w:szCs w:val="20"/>
+        </w:rPr>
+      </w:r>
+      <w:r>
+        <w:rPr>
           <w:b/>
           <w:color w:val="000000"/>
           <w:sz w:val="20"/>
         </w:rPr>
-        <w:t>AI &amp; Automation (25%):</w:t>
+        <w:t>Frontend (15%):</w:t>
       </w:r>
       <w:r>
         <w:rPr>
           <w:color w:val="000000"/>
           <w:sz w:val="20"/>
         </w:rPr>
-        <w:t xml:space="preserve"> GitHub Copilot, Agentic AI, </w:t>
-      </w:r>
-      <w:proofErr w:type="spellStart"/>
-      <w:r>
-        <w:rPr>
-          <w:color w:val="000000"/>
-          <w:sz w:val="20"/>
-        </w:rPr>
-        <w:t>APScheduler</w:t>
-      </w:r>
-      <w:proofErr w:type="spellEnd"/>
-      <w:r>
-        <w:rPr>
-          <w:color w:val="000000"/>
-          <w:sz w:val="20"/>
-        </w:rPr>
-        <w:t xml:space="preserve">, pandas, </w:t>
-      </w:r>
-      <w:proofErr w:type="spellStart"/>
-      <w:r>
-        <w:rPr>
-          <w:color w:val="000000"/>
-          <w:sz w:val="20"/>
-        </w:rPr>
-        <w:t>LangChain</w:t>
-      </w:r>
-      <w:proofErr w:type="spellEnd"/>
-      <w:r>
-        <w:rPr>
-          <w:color w:val="000000"/>
-          <w:sz w:val="20"/>
-        </w:rPr>
-        <w:t>, OpenAI API, Plan-driven development.</w:t>
-      </w:r>
-    </w:p>
-    <w:p>
-      <w:pPr>
-        <w:pStyle w:val="paragraph"/>
-        <w:numPr>
-          <w:ilvl w:val="0"/>
-          <w:numId w:val="9"/>
-        </w:numPr>
-        <w:spacing w:before="0" w:beforeAutospacing="0" w:after="0" w:afterAutospacing="0"/>
-        <w:rPr>
-          <w:rFonts w:ascii="Verdana" w:hAnsi="Verdana" w:cs="Arial"/>
-          <w:color w:val="000000" w:themeColor="text1"/>
-          <w:sz w:val="20"/>
-          <w:szCs w:val="20"/>
-        </w:rPr>
-      </w:pPr>
-      <w:r>
-        <w:rPr>
-          <w:rFonts w:ascii="Verdana" w:hAnsi="Verdana" w:cs="Arial"/>
-          <w:color w:val="000000" w:themeColor="text1"/>
-          <w:sz w:val="20"/>
-          <w:szCs w:val="20"/>
-        </w:rPr>
-        <w:t>Cloud &amp; DevOps: AWS, GCP, Kubernetes, Docker; CI/CD with Jenkins, GitHub Actions, Ansible.</w:t>
-      </w:r>
-    </w:p>
-    <w:p>
-      <w:pPr>
-        <w:pStyle w:val="paragraph"/>
-        <w:numPr>
-          <w:ilvl w:val="0"/>
-          <w:numId w:val="9"/>
-        </w:numPr>
-        <w:spacing w:before="0" w:beforeAutospacing="0" w:after="0" w:afterAutospacing="0"/>
-        <w:rPr>
-          <w:rFonts w:ascii="Verdana" w:hAnsi="Verdana" w:cs="Arial"/>
-          <w:color w:val="000000" w:themeColor="text1"/>
-          <w:sz w:val="20"/>
-          <w:szCs w:val="20"/>
-        </w:rPr>
-      </w:pPr>
-      <w:r>
-        <w:rPr>
-          <w:b/>
-          <w:color w:val="000000"/>
-          <w:sz w:val="20"/>
-        </w:rPr>
-        <w:t>Data &amp; Delivery:</w:t>
-      </w:r>
-      <w:r>
-        <w:rPr>
-          <w:color w:val="000000"/>
-          <w:sz w:val="20"/>
-        </w:rPr>
-        <w:t xml:space="preserve"> Oracle, PostgreSQL, MongoDB; Kafka/RabbitMQ; Agile/Scrum, cross-functional collaboration.</w:t>
-      </w:r>
-    </w:p>
-    <w:p>
-      <w:pPr>
-        <w:pStyle w:val="paragraph"/>
-        <w:numPr>
-          <w:ilvl w:val="0"/>
-          <w:numId w:val="9"/>
-        </w:numPr>
-        <w:spacing w:before="0" w:beforeAutospacing="0" w:after="0" w:afterAutospacing="0"/>
-        <w:rPr>
-          <w:rFonts w:ascii="Verdana" w:hAnsi="Verdana" w:cs="Arial"/>
-          <w:color w:val="000000" w:themeColor="text1"/>
-          <w:sz w:val="20"/>
-          <w:szCs w:val="20"/>
-        </w:rPr>
-      </w:pPr>
-      <w:r>
-        <w:rPr>
-          <w:b/>
-          <w:color w:val="000000"/>
-          <w:sz w:val="20"/>
-        </w:rPr>
-        <w:t>Frontend (15%):</w:t>
-      </w:r>
-      <w:r>
-        <w:rPr>
-          <w:color w:val="000000"/>
-          <w:sz w:val="20"/>
-        </w:rPr>
-        <w:t xml:space="preserve"> Angular 16+, TypeScript, </w:t>
-      </w:r>
-      <w:proofErr w:type="spellStart"/>
-      <w:r>
-        <w:rPr>
-          <w:color w:val="000000"/>
-          <w:sz w:val="20"/>
-        </w:rPr>
-        <w:t>RxJS</w:t>
-      </w:r>
-      <w:proofErr w:type="spellEnd"/>
-      <w:r>
-        <w:rPr>
-          <w:color w:val="000000"/>
-          <w:sz w:val="20"/>
-        </w:rPr>
-        <w:t>, Bootstrap, responsive UI/UX.</w:t>
+        <w:t xml:space="preserve"> Angular 16+, TypeScript, RxJS, Bootstrap, responsive UI/UX.</w:t>
       </w:r>
     </w:p>
     <w:p>
@@ -951,49 +1084,7 @@
         <w:rPr>
           <w:sz w:val="20"/>
         </w:rPr>
-        <w:t xml:space="preserve"> GitHub Copilot, Agentic AI Workflows, scikit-learn, Flask, </w:t>
-      </w:r>
-      <w:proofErr w:type="spellStart"/>
-      <w:r>
-        <w:rPr>
-          <w:sz w:val="20"/>
-        </w:rPr>
-        <w:t>joblib</w:t>
-      </w:r>
-      <w:proofErr w:type="spellEnd"/>
-      <w:r>
-        <w:rPr>
-          <w:sz w:val="20"/>
-        </w:rPr>
-        <w:t xml:space="preserve">, </w:t>
-      </w:r>
-      <w:proofErr w:type="spellStart"/>
-      <w:r>
-        <w:rPr>
-          <w:sz w:val="20"/>
-        </w:rPr>
-        <w:t>APScheduler</w:t>
-      </w:r>
-      <w:proofErr w:type="spellEnd"/>
-      <w:r>
-        <w:rPr>
-          <w:sz w:val="20"/>
-        </w:rPr>
-        <w:t xml:space="preserve">, pandas, NumPy, </w:t>
-      </w:r>
-      <w:proofErr w:type="spellStart"/>
-      <w:r>
-        <w:rPr>
-          <w:sz w:val="20"/>
-        </w:rPr>
-        <w:t>cx_Oracle</w:t>
-      </w:r>
-      <w:proofErr w:type="spellEnd"/>
-      <w:r>
-        <w:rPr>
-          <w:sz w:val="20"/>
-        </w:rPr>
-        <w:t xml:space="preserve"> </w:t>
+        <w:t xml:space="preserve"> GitHub Copilot, Agentic AI Workflows, scikit-learn, Flask, joblib, APScheduler, pandas, NumPy, cx_Oracle </w:t>
       </w:r>
     </w:p>
     <w:p>
@@ -2021,27 +2112,7 @@
           <w:sz w:val="20"/>
           <w:szCs w:val="20"/>
         </w:rPr>
-        <w:t xml:space="preserve">Investigated/mitigated file attachment limitations (e.g., unsupported types with </w:t>
-      </w:r>
-      <w:proofErr w:type="spellStart"/>
-      <w:r>
-        <w:rPr>
-          <w:rFonts w:ascii="Verdana" w:eastAsia="Verdana" w:hAnsi="Verdana" w:cs="Verdana"/>
-          <w:color w:val="000000" w:themeColor="text1"/>
-          <w:sz w:val="20"/>
-          <w:szCs w:val="20"/>
-        </w:rPr>
-        <w:t>Lastline</w:t>
-      </w:r>
-      <w:proofErr w:type="spellEnd"/>
-      <w:r>
-        <w:rPr>
-          <w:rFonts w:ascii="Verdana" w:eastAsia="Verdana" w:hAnsi="Verdana" w:cs="Verdana"/>
-          <w:color w:val="000000" w:themeColor="text1"/>
-          <w:sz w:val="20"/>
-          <w:szCs w:val="20"/>
-        </w:rPr>
-        <w:t xml:space="preserve"> API), improving file handling efficiency by 20%. </w:t>
+        <w:t xml:space="preserve">Investigated/mitigated file attachment limitations (e.g., unsupported types with Lastline API), improving file handling efficiency by 20%. </w:t>
       </w:r>
     </w:p>
     <w:p>
@@ -2111,291 +2182,51 @@
           <w:color w:val="000000"/>
           <w:sz w:val="20"/>
         </w:rPr>
-        <w:t>Designed and built an end-to-end GINR feasibility screening ML system — engineering 20 features from 16 Oracle DB tables (</w:t>
-      </w:r>
-      <w:proofErr w:type="spellStart"/>
+        <w:t>Designed and built an end-to-end GINR feasibility screening ML system — engineering 20 features from 16 Oracle DB tables (ginr_request, POIB_DATA, CONNECTIVITY_NODES, MOST_LIMITING_SERIES_ELEMENTS, CONGESTION_MANAGEMENT_ZONES), training a scikit-learn Logistic Regression pipeline (ROC-AUC &gt; 0.85, 5-fold CV), and serving real-time PASS/FAIL predictions via a Flask REST microservice (port 5050) integrated with the existing Spring Boot RARF application.</w:t>
+      </w:r>
+    </w:p>
+    <w:p>
+      <w:pPr>
+        <w:pStyle w:val="paragraph"/>
+        <w:numPr>
+          <w:ilvl w:val="0"/>
+          <w:numId w:val="8"/>
+        </w:numPr>
+        <w:rPr>
+          <w:rFonts w:ascii="Verdana" w:eastAsia="Verdana" w:hAnsi="Verdana" w:cs="Verdana"/>
+          <w:color w:val="000000" w:themeColor="text1"/>
+          <w:sz w:val="20"/>
+          <w:szCs w:val="20"/>
+        </w:rPr>
+      </w:pPr>
       <w:r>
         <w:rPr>
           <w:color w:val="000000"/>
           <w:sz w:val="20"/>
         </w:rPr>
-        <w:t>ginr_request</w:t>
-      </w:r>
-      <w:proofErr w:type="spellEnd"/>
+        <w:t>Architected a full ML lifecycle system: ColumnTransformer feature pipeline (StandardScaler, OneHotEncoder, SimpleImputer), versioned model registry (semantic versioning with joblib), prediction audit log, drift detection (15% FAIL-rate threshold), and automated retraining feedback loop triggered by Oracle CR status transitions (SENT_BACK / READY_FOR_MODELING). Deployed 4-tier risk scoring output (LOW/MEDIUM/HIGH/CRITICAL) with top risk factor explanations surfaced to developers at submission time.</w:t>
+      </w:r>
+    </w:p>
+    <w:p>
+      <w:pPr>
+        <w:pStyle w:val="paragraph"/>
+        <w:numPr>
+          <w:ilvl w:val="0"/>
+          <w:numId w:val="8"/>
+        </w:numPr>
+        <w:rPr>
+          <w:rFonts w:ascii="Verdana" w:eastAsia="Verdana" w:hAnsi="Verdana" w:cs="Verdana"/>
+          <w:color w:val="000000" w:themeColor="text1"/>
+          <w:sz w:val="20"/>
+          <w:szCs w:val="20"/>
+        </w:rPr>
+      </w:pPr>
       <w:r>
         <w:rPr>
           <w:color w:val="000000"/>
           <w:sz w:val="20"/>
         </w:rPr>
-        <w:t>, POIB_DATA, CONNECTIVITY_NODES, MOST_LIMITING_SERIES_ELEMENTS, CONGESTION_MANAGEMENT_ZONES), training a scikit-learn Logistic Regression pipeline (ROC-AUC &gt; 0.85, 5-fold CV), and serving real-time PASS/FAIL predictions via a Flask REST microservice (port 5050) integrated with the existing Spring Boot RARF application.</w:t>
-      </w:r>
-    </w:p>
-    <w:p>
-      <w:pPr>
-        <w:pStyle w:val="paragraph"/>
-        <w:numPr>
-          <w:ilvl w:val="0"/>
-          <w:numId w:val="8"/>
-        </w:numPr>
-        <w:rPr>
-          <w:rFonts w:ascii="Verdana" w:eastAsia="Verdana" w:hAnsi="Verdana" w:cs="Verdana"/>
-          <w:color w:val="000000" w:themeColor="text1"/>
-          <w:sz w:val="20"/>
-          <w:szCs w:val="20"/>
-        </w:rPr>
-      </w:pPr>
-      <w:r>
-        <w:rPr>
-          <w:color w:val="000000"/>
-          <w:sz w:val="20"/>
-        </w:rPr>
-        <w:t xml:space="preserve">Architected a full ML lifecycle system: </w:t>
-      </w:r>
-      <w:proofErr w:type="spellStart"/>
-      <w:r>
-        <w:rPr>
-          <w:color w:val="000000"/>
-          <w:sz w:val="20"/>
-        </w:rPr>
-        <w:t>ColumnTransformer</w:t>
-      </w:r>
-      <w:proofErr w:type="spellEnd"/>
-      <w:r>
-        <w:rPr>
-          <w:color w:val="000000"/>
-          <w:sz w:val="20"/>
-        </w:rPr>
-        <w:t xml:space="preserve"> feature pipeline (</w:t>
-      </w:r>
-      <w:proofErr w:type="spellStart"/>
-      <w:r>
-        <w:rPr>
-          <w:color w:val="000000"/>
-          <w:sz w:val="20"/>
-        </w:rPr>
-        <w:t>StandardScaler</w:t>
-      </w:r>
-      <w:proofErr w:type="spellEnd"/>
-      <w:r>
-        <w:rPr>
-          <w:color w:val="000000"/>
-          <w:sz w:val="20"/>
-        </w:rPr>
-        <w:t xml:space="preserve">, </w:t>
-      </w:r>
-      <w:proofErr w:type="spellStart"/>
-      <w:r>
-        <w:rPr>
-          <w:color w:val="000000"/>
-          <w:sz w:val="20"/>
-        </w:rPr>
-        <w:t>OneHotEncoder</w:t>
-      </w:r>
-      <w:proofErr w:type="spellEnd"/>
-      <w:r>
-        <w:rPr>
-          <w:color w:val="000000"/>
-          <w:sz w:val="20"/>
-        </w:rPr>
-        <w:t xml:space="preserve">, </w:t>
-      </w:r>
-      <w:proofErr w:type="spellStart"/>
-      <w:r>
-        <w:rPr>
-          <w:color w:val="000000"/>
-          <w:sz w:val="20"/>
-        </w:rPr>
-        <w:t>SimpleImputer</w:t>
-      </w:r>
-      <w:proofErr w:type="spellEnd"/>
-      <w:r>
-        <w:rPr>
-          <w:color w:val="000000"/>
-          <w:sz w:val="20"/>
-        </w:rPr>
-        <w:t xml:space="preserve">), versioned model registry (semantic versioning with </w:t>
-      </w:r>
-      <w:proofErr w:type="spellStart"/>
-      <w:r>
-        <w:rPr>
-          <w:color w:val="000000"/>
-          <w:sz w:val="20"/>
-        </w:rPr>
-        <w:t>joblib</w:t>
-      </w:r>
-      <w:proofErr w:type="spellEnd"/>
-      <w:r>
-        <w:rPr>
-          <w:color w:val="000000"/>
-          <w:sz w:val="20"/>
-        </w:rPr>
-        <w:t>), prediction audit log, drift detection (15% FAIL-rate threshold), and automated retraining feedback loop triggered by Oracle CR status transitions (SENT_BACK / READY_FOR_MODELING). Deployed 4-tier risk scoring output (LOW/MEDIUM/HIGH/CRITICAL) with top risk factor explanations surfaced to developers at submission time.</w:t>
-      </w:r>
-    </w:p>
-    <w:p>
-      <w:pPr>
-        <w:pStyle w:val="paragraph"/>
-        <w:numPr>
-          <w:ilvl w:val="0"/>
-          <w:numId w:val="8"/>
-        </w:numPr>
-        <w:rPr>
-          <w:rFonts w:ascii="Verdana" w:eastAsia="Verdana" w:hAnsi="Verdana" w:cs="Verdana"/>
-          <w:color w:val="000000" w:themeColor="text1"/>
-          <w:sz w:val="20"/>
-          <w:szCs w:val="20"/>
-        </w:rPr>
-      </w:pPr>
-      <w:r>
-        <w:rPr>
-          <w:color w:val="000000"/>
-          <w:sz w:val="20"/>
-        </w:rPr>
-        <w:t xml:space="preserve">Engineered derived features from Oracle data: </w:t>
-      </w:r>
-      <w:proofErr w:type="spellStart"/>
-      <w:r>
-        <w:rPr>
-          <w:color w:val="000000"/>
-          <w:sz w:val="20"/>
-        </w:rPr>
-        <w:t>crez_flag</w:t>
-      </w:r>
-      <w:proofErr w:type="spellEnd"/>
-      <w:r>
-        <w:rPr>
-          <w:color w:val="000000"/>
-          <w:sz w:val="20"/>
-        </w:rPr>
-        <w:t xml:space="preserve"> (PUCT CREZ county mapping), </w:t>
-      </w:r>
-      <w:proofErr w:type="spellStart"/>
-      <w:r>
-        <w:rPr>
-          <w:color w:val="000000"/>
-          <w:sz w:val="20"/>
-        </w:rPr>
-        <w:t>months_to_cod</w:t>
-      </w:r>
-      <w:proofErr w:type="spellEnd"/>
-      <w:r>
-        <w:rPr>
-          <w:color w:val="000000"/>
-          <w:sz w:val="20"/>
-        </w:rPr>
-        <w:t xml:space="preserve"> (COD-</w:t>
-      </w:r>
-      <w:proofErr w:type="spellStart"/>
-      <w:r>
-        <w:rPr>
-          <w:color w:val="000000"/>
-          <w:sz w:val="20"/>
-        </w:rPr>
-        <w:t>submitDate</w:t>
-      </w:r>
-      <w:proofErr w:type="spellEnd"/>
-      <w:r>
-        <w:rPr>
-          <w:color w:val="000000"/>
-          <w:sz w:val="20"/>
-        </w:rPr>
-        <w:t xml:space="preserve">), </w:t>
-      </w:r>
-      <w:proofErr w:type="spellStart"/>
-      <w:r>
-        <w:rPr>
-          <w:color w:val="000000"/>
-          <w:sz w:val="20"/>
-        </w:rPr>
-        <w:t>project_exceeds_thermal_flag</w:t>
-      </w:r>
-      <w:proofErr w:type="spellEnd"/>
-      <w:r>
-        <w:rPr>
-          <w:color w:val="000000"/>
-          <w:sz w:val="20"/>
-        </w:rPr>
-        <w:t xml:space="preserve"> (</w:t>
-      </w:r>
-      <w:proofErr w:type="spellStart"/>
-      <w:r>
-        <w:rPr>
-          <w:color w:val="000000"/>
-          <w:sz w:val="20"/>
-        </w:rPr>
-        <w:t>project_mw</w:t>
-      </w:r>
-      <w:proofErr w:type="spellEnd"/>
-      <w:r>
-        <w:rPr>
-          <w:color w:val="000000"/>
-          <w:sz w:val="20"/>
-        </w:rPr>
-        <w:t xml:space="preserve"> &gt; MIN MLSE rating), </w:t>
-      </w:r>
-      <w:proofErr w:type="spellStart"/>
-      <w:r>
-        <w:rPr>
-          <w:color w:val="000000"/>
-          <w:sz w:val="20"/>
-        </w:rPr>
-        <w:t>nameplate_to_maxgen_ratio</w:t>
-      </w:r>
-      <w:proofErr w:type="spellEnd"/>
-      <w:r>
-        <w:rPr>
-          <w:color w:val="000000"/>
-          <w:sz w:val="20"/>
-        </w:rPr>
-        <w:t xml:space="preserve"> (overbuild detection); implemented Flask microservice (ginr_prediction_api.py) exposing 6 endpoints: POST /</w:t>
-      </w:r>
-      <w:proofErr w:type="spellStart"/>
-      <w:r>
-        <w:rPr>
-          <w:color w:val="000000"/>
-          <w:sz w:val="20"/>
-        </w:rPr>
-        <w:t>api</w:t>
-      </w:r>
-      <w:proofErr w:type="spellEnd"/>
-      <w:r>
-        <w:rPr>
-          <w:color w:val="000000"/>
-          <w:sz w:val="20"/>
-        </w:rPr>
-        <w:t xml:space="preserve">/v1/score, batch, GET score/{id}, health, model/info, drift — consumed by Spring Boot </w:t>
-      </w:r>
-      <w:proofErr w:type="spellStart"/>
-      <w:r>
-        <w:rPr>
-          <w:color w:val="000000"/>
-          <w:sz w:val="20"/>
-        </w:rPr>
-        <w:t>RestTemplate</w:t>
-      </w:r>
-      <w:proofErr w:type="spellEnd"/>
-      <w:r>
-        <w:rPr>
-          <w:color w:val="000000"/>
-          <w:sz w:val="20"/>
-        </w:rPr>
-        <w:t xml:space="preserve"> in </w:t>
-      </w:r>
-      <w:proofErr w:type="spellStart"/>
-      <w:r>
-        <w:rPr>
-          <w:color w:val="000000"/>
-          <w:sz w:val="20"/>
-        </w:rPr>
-        <w:t>ChangeRequestService</w:t>
-      </w:r>
-      <w:proofErr w:type="spellEnd"/>
-      <w:r>
-        <w:rPr>
-          <w:color w:val="000000"/>
-          <w:sz w:val="20"/>
-        </w:rPr>
-        <w:t>.</w:t>
+        <w:t>Engineered derived features from Oracle data: crez_flag (PUCT CREZ county mapping), months_to_cod (COD-submitDate), project_exceeds_thermal_flag (project_mw &gt; MIN MLSE rating), nameplate_to_maxgen_ratio (overbuild detection); implemented Flask microservice (ginr_prediction_api.py) exposing 6 endpoints: POST /api/v1/score, batch, GET score/{id}, health, model/info, drift — consumed by Spring Boot RestTemplate in ChangeRequestService.</w:t>
       </w:r>
     </w:p>
     <w:p>
@@ -2441,23 +2272,51 @@
           <w:color w:val="000000"/>
           <w:sz w:val="20"/>
         </w:rPr>
-        <w:t xml:space="preserve">Designed and built an end-to-end automated GINR payment failure monitoring pipeline in Python using </w:t>
-      </w:r>
-      <w:proofErr w:type="spellStart"/>
+        <w:t>Designed and built an end-to-end automated GINR payment failure monitoring pipeline in Python using APScheduler, pandas, and Oracle DB — detecting 7 categories of payment failures (unpaid FIS/SS/Analysis fees, Authorize.net sync errors, amount mismatches, duplicate payments, stale PENDING_REVIEW CRs) across 100+ daily records and delivering severity-prioritized HTML/CSV reports to operations managers.</w:t>
+      </w:r>
+    </w:p>
+    <w:p>
+      <w:pPr>
+        <w:pStyle w:val="paragraph"/>
+        <w:numPr>
+          <w:ilvl w:val="0"/>
+          <w:numId w:val="8"/>
+        </w:numPr>
+        <w:rPr>
+          <w:rFonts w:ascii="Verdana" w:eastAsia="Verdana" w:hAnsi="Verdana" w:cs="Verdana"/>
+          <w:color w:val="000000" w:themeColor="text1"/>
+          <w:sz w:val="20"/>
+          <w:szCs w:val="20"/>
+        </w:rPr>
+      </w:pPr>
       <w:r>
         <w:rPr>
           <w:color w:val="000000"/>
           <w:sz w:val="20"/>
         </w:rPr>
-        <w:t>APScheduler</w:t>
-      </w:r>
-      <w:proofErr w:type="spellEnd"/>
+        <w:t>Architected a production-grade BlockingScheduler with CronTrigger (7:00 AM CST daily), 1-hour misfire grace window, job coalescing, max_instances=1, and SIGTERM-based graceful shutdown for Docker/systemd environments; built audit trail CSV for trend analysis and implemented --dry-run / --now CLI flags for safe QA testing.</w:t>
+      </w:r>
+    </w:p>
+    <w:p>
+      <w:pPr>
+        <w:pStyle w:val="paragraph"/>
+        <w:numPr>
+          <w:ilvl w:val="0"/>
+          <w:numId w:val="8"/>
+        </w:numPr>
+        <w:rPr>
+          <w:rFonts w:ascii="Verdana" w:eastAsia="Verdana" w:hAnsi="Verdana" w:cs="Verdana"/>
+          <w:color w:val="000000" w:themeColor="text1"/>
+          <w:sz w:val="20"/>
+          <w:szCs w:val="20"/>
+        </w:rPr>
+      </w:pPr>
       <w:r>
         <w:rPr>
           <w:color w:val="000000"/>
           <w:sz w:val="20"/>
         </w:rPr>
-        <w:t>, pandas, and Oracle DB — detecting 7 categories of payment failures (unpaid FIS/SS/Analysis fees, Authorize.net sync errors, amount mismatches, duplicate payments, stale PENDING_REVIEW CRs) across 100+ daily records and delivering severity-prioritized HTML/CSV reports to operations managers.</w:t>
+        <w:t>Developed rich HTML email notification system using Python smtplib/MIME — dynamic severity banners (CRITICAL/HIGH/MEDIUM/ALL CLEAR), color-coded failure sections with detail tables, embedded Oracle verification SQL, and attached CSV reports delivered via ERCOT's Office 365 SMTP relay with auto-escalating subject lines.</w:t>
       </w:r>
     </w:p>
     <w:p>
@@ -2476,270 +2335,18 @@
       </w:pPr>
       <w:r>
         <w:rPr>
+          <w:b/>
           <w:color w:val="000000"/>
           <w:sz w:val="20"/>
         </w:rPr>
-        <w:t xml:space="preserve">Architected a production-grade </w:t>
-      </w:r>
-      <w:proofErr w:type="spellStart"/>
+        <w:t xml:space="preserve">Tech: </w:t>
+      </w:r>
       <w:r>
         <w:rPr>
           <w:color w:val="000000"/>
           <w:sz w:val="20"/>
         </w:rPr>
-        <w:t>BlockingScheduler</w:t>
-      </w:r>
-      <w:proofErr w:type="spellEnd"/>
-      <w:r>
-        <w:rPr>
-          <w:color w:val="000000"/>
-          <w:sz w:val="20"/>
-        </w:rPr>
-        <w:t xml:space="preserve"> with </w:t>
-      </w:r>
-      <w:proofErr w:type="spellStart"/>
-      <w:r>
-        <w:rPr>
-          <w:color w:val="000000"/>
-          <w:sz w:val="20"/>
-        </w:rPr>
-        <w:t>CronTrigger</w:t>
-      </w:r>
-      <w:proofErr w:type="spellEnd"/>
-      <w:r>
-        <w:rPr>
-          <w:color w:val="000000"/>
-          <w:sz w:val="20"/>
-        </w:rPr>
-        <w:t xml:space="preserve"> (7:00 AM CST daily), 1-hour misfire grace window, job coalescing, </w:t>
-      </w:r>
-      <w:proofErr w:type="spellStart"/>
-      <w:r>
-        <w:rPr>
-          <w:color w:val="000000"/>
-          <w:sz w:val="20"/>
-        </w:rPr>
-        <w:t>max_instances</w:t>
-      </w:r>
-      <w:proofErr w:type="spellEnd"/>
-      <w:r>
-        <w:rPr>
-          <w:color w:val="000000"/>
-          <w:sz w:val="20"/>
-        </w:rPr>
-        <w:t>=1, and SIGTERM-based graceful shutdown for Docker/</w:t>
-      </w:r>
-      <w:proofErr w:type="spellStart"/>
-      <w:r>
-        <w:rPr>
-          <w:color w:val="000000"/>
-          <w:sz w:val="20"/>
-        </w:rPr>
-        <w:t>systemd</w:t>
-      </w:r>
-      <w:proofErr w:type="spellEnd"/>
-      <w:r>
-        <w:rPr>
-          <w:color w:val="000000"/>
-          <w:sz w:val="20"/>
-        </w:rPr>
-        <w:t xml:space="preserve"> environments; built audit trail CSV for trend analysis and implemented --dry-</w:t>
-      </w:r>
-      <w:proofErr w:type="gramStart"/>
-      <w:r>
-        <w:rPr>
-          <w:color w:val="000000"/>
-          <w:sz w:val="20"/>
-        </w:rPr>
-        <w:t>run / -</w:t>
-      </w:r>
-      <w:proofErr w:type="gramEnd"/>
-      <w:r>
-        <w:rPr>
-          <w:color w:val="000000"/>
-          <w:sz w:val="20"/>
-        </w:rPr>
-        <w:t>-now CLI flags for safe QA testing.</w:t>
-      </w:r>
-    </w:p>
-    <w:p>
-      <w:pPr>
-        <w:pStyle w:val="paragraph"/>
-        <w:numPr>
-          <w:ilvl w:val="0"/>
-          <w:numId w:val="8"/>
-        </w:numPr>
-        <w:rPr>
-          <w:rFonts w:ascii="Verdana" w:eastAsia="Verdana" w:hAnsi="Verdana" w:cs="Verdana"/>
-          <w:color w:val="000000" w:themeColor="text1"/>
-          <w:sz w:val="20"/>
-          <w:szCs w:val="20"/>
-        </w:rPr>
-      </w:pPr>
-      <w:r>
-        <w:rPr>
-          <w:color w:val="000000"/>
-          <w:sz w:val="20"/>
-        </w:rPr>
-        <w:t xml:space="preserve">Developed rich HTML email notification system using Python </w:t>
-      </w:r>
-      <w:proofErr w:type="spellStart"/>
-      <w:r>
-        <w:rPr>
-          <w:color w:val="000000"/>
-          <w:sz w:val="20"/>
-        </w:rPr>
-        <w:t>smtplib</w:t>
-      </w:r>
-      <w:proofErr w:type="spellEnd"/>
-      <w:r>
-        <w:rPr>
-          <w:color w:val="000000"/>
-          <w:sz w:val="20"/>
-        </w:rPr>
-        <w:t>/MIME — dynamic severity banners (CRITICAL/HIGH/MEDIUM/ALL CLEAR), color-coded failure sections with detail tables, embedded Oracle verification SQL, and attached CSV reports delivered via ERCOT's Office 365 SMTP relay with auto-escalating subject lines.</w:t>
-      </w:r>
-    </w:p>
-    <w:p>
-      <w:pPr>
-        <w:pStyle w:val="paragraph"/>
-        <w:numPr>
-          <w:ilvl w:val="0"/>
-          <w:numId w:val="8"/>
-        </w:numPr>
-        <w:rPr>
-          <w:rFonts w:ascii="Verdana" w:eastAsia="Verdana" w:hAnsi="Verdana" w:cs="Verdana"/>
-          <w:color w:val="000000" w:themeColor="text1"/>
-          <w:sz w:val="20"/>
-          <w:szCs w:val="20"/>
-        </w:rPr>
-      </w:pPr>
-      <w:r>
-        <w:rPr>
-          <w:b/>
-          <w:color w:val="000000"/>
-          <w:sz w:val="20"/>
-        </w:rPr>
-        <w:t xml:space="preserve">Tech: </w:t>
-      </w:r>
-      <w:r>
-        <w:rPr>
-          <w:color w:val="000000"/>
-          <w:sz w:val="20"/>
-        </w:rPr>
-        <w:t xml:space="preserve">Python 3.10, scikit-learn (Logistic Regression, Pipeline, </w:t>
-      </w:r>
-      <w:proofErr w:type="spellStart"/>
-      <w:r>
-        <w:rPr>
-          <w:color w:val="000000"/>
-          <w:sz w:val="20"/>
-        </w:rPr>
-        <w:t>ColumnTransformer</w:t>
-      </w:r>
-      <w:proofErr w:type="spellEnd"/>
-      <w:r>
-        <w:rPr>
-          <w:color w:val="000000"/>
-          <w:sz w:val="20"/>
-        </w:rPr>
-        <w:t xml:space="preserve">), Flask, pandas, NumPy, </w:t>
-      </w:r>
-      <w:proofErr w:type="spellStart"/>
-      <w:r>
-        <w:rPr>
-          <w:color w:val="000000"/>
-          <w:sz w:val="20"/>
-        </w:rPr>
-        <w:t>joblib</w:t>
-      </w:r>
-      <w:proofErr w:type="spellEnd"/>
-      <w:r>
-        <w:rPr>
-          <w:color w:val="000000"/>
-          <w:sz w:val="20"/>
-        </w:rPr>
-        <w:t xml:space="preserve">, Oracle SQL (16-table JOIN), Java 17, JAX-RS/Jersey, Spring Boot </w:t>
-      </w:r>
-      <w:proofErr w:type="spellStart"/>
-      <w:r>
-        <w:rPr>
-          <w:color w:val="000000"/>
-          <w:sz w:val="20"/>
-        </w:rPr>
-        <w:t>RestTemplate</w:t>
-      </w:r>
-      <w:proofErr w:type="spellEnd"/>
-      <w:r>
-        <w:rPr>
-          <w:color w:val="000000"/>
-          <w:sz w:val="20"/>
-        </w:rPr>
-        <w:t xml:space="preserve">, JPA/Hibernate, Angular 16, TypeScript, </w:t>
-      </w:r>
-      <w:proofErr w:type="spellStart"/>
-      <w:r>
-        <w:rPr>
-          <w:color w:val="000000"/>
-          <w:sz w:val="20"/>
-        </w:rPr>
-        <w:t>RxJS</w:t>
-      </w:r>
-      <w:proofErr w:type="spellEnd"/>
-      <w:r>
-        <w:rPr>
-          <w:color w:val="000000"/>
-          <w:sz w:val="20"/>
-        </w:rPr>
-        <w:t xml:space="preserve">, </w:t>
-      </w:r>
-      <w:proofErr w:type="spellStart"/>
-      <w:r>
-        <w:rPr>
-          <w:color w:val="000000"/>
-          <w:sz w:val="20"/>
-        </w:rPr>
-        <w:t>APScheduler</w:t>
-      </w:r>
-      <w:proofErr w:type="spellEnd"/>
-      <w:r>
-        <w:rPr>
-          <w:color w:val="000000"/>
-          <w:sz w:val="20"/>
-        </w:rPr>
-        <w:t xml:space="preserve">, </w:t>
-      </w:r>
-      <w:proofErr w:type="spellStart"/>
-      <w:r>
-        <w:rPr>
-          <w:color w:val="000000"/>
-          <w:sz w:val="20"/>
-        </w:rPr>
-        <w:t>smtplib</w:t>
-      </w:r>
-      <w:proofErr w:type="spellEnd"/>
-      <w:r>
-        <w:rPr>
-          <w:color w:val="000000"/>
-          <w:sz w:val="20"/>
-        </w:rPr>
-        <w:t xml:space="preserve">/MIME, </w:t>
-      </w:r>
-      <w:proofErr w:type="spellStart"/>
-      <w:r>
-        <w:rPr>
-          <w:color w:val="000000"/>
-          <w:sz w:val="20"/>
-        </w:rPr>
-        <w:t>cx_Oracle</w:t>
-      </w:r>
-      <w:proofErr w:type="spellEnd"/>
-      <w:r>
-        <w:rPr>
-          <w:color w:val="000000"/>
-          <w:sz w:val="20"/>
-        </w:rPr>
-        <w:t>, Docker, Jenkins, Maven, GitHub Copilot (Agentic AI)</w:t>
+        <w:t>Python 3.10, scikit-learn (Logistic Regression, Pipeline, ColumnTransformer), Flask, pandas, NumPy, joblib, Oracle SQL (16-table JOIN), Java 17, JAX-RS/Jersey, Spring Boot RestTemplate, JPA/Hibernate, Angular 16, TypeScript, RxJS, APScheduler, smtplib/MIME, cx_Oracle, Docker, Jenkins, Maven, GitHub Copilot (Agentic AI)</w:t>
       </w:r>
     </w:p>
     <w:p>
@@ -3068,7 +2675,6 @@
           <w:sz w:val="20"/>
           <w:szCs w:val="20"/>
         </w:rPr>
-        <w:lastRenderedPageBreak/>
         <w:t>Deployed services on AWS &amp; GCP; achieved 99.9% uptime and 50% cost reduction via autoscaling and right</w:t>
       </w:r>
       <w:r>
@@ -3880,29 +3486,7 @@
           <w:sz w:val="20"/>
           <w:szCs w:val="20"/>
         </w:rPr>
-        <w:t xml:space="preserve"> and </w:t>
-      </w:r>
-      <w:proofErr w:type="spellStart"/>
-      <w:r>
-        <w:rPr>
-          <w:rStyle w:val="normaltextrun"/>
-          <w:rFonts w:ascii="Verdana" w:eastAsia="Arial" w:hAnsi="Verdana" w:cs="Arial"/>
-          <w:color w:val="000000" w:themeColor="text1"/>
-          <w:sz w:val="20"/>
-          <w:szCs w:val="20"/>
-        </w:rPr>
-        <w:t>GraphQL</w:t>
-      </w:r>
-      <w:proofErr w:type="spellEnd"/>
-      <w:r>
-        <w:rPr>
-          <w:rStyle w:val="normaltextrun"/>
-          <w:rFonts w:ascii="Verdana" w:eastAsia="Arial" w:hAnsi="Verdana" w:cs="Arial"/>
-          <w:color w:val="000000" w:themeColor="text1"/>
-          <w:sz w:val="20"/>
-          <w:szCs w:val="20"/>
-        </w:rPr>
-        <w:t>, ensuring seamless and efficient communication between frontend and backend services.</w:t>
+        <w:t xml:space="preserve"> and GraphQL, ensuring seamless and efficient communication between frontend and backend services.</w:t>
       </w:r>
     </w:p>
     <w:p>
@@ -4132,7 +3716,6 @@
           <w:sz w:val="20"/>
           <w:szCs w:val="20"/>
         </w:rPr>
-        <w:lastRenderedPageBreak/>
         <w:t>Sr. Java Developer |May 2012 – July 2015</w:t>
       </w:r>
     </w:p>
@@ -4237,27 +3820,15 @@
           <w:szCs w:val="20"/>
         </w:rPr>
       </w:pPr>
-      <w:proofErr w:type="gramStart"/>
-      <w:r>
-        <w:rPr>
-          <w:rStyle w:val="normaltextrun"/>
-          <w:rFonts w:ascii="Verdana" w:eastAsia="Arial" w:hAnsi="Verdana" w:cs="Arial"/>
-          <w:color w:val="000000" w:themeColor="text1"/>
-          <w:sz w:val="20"/>
-          <w:szCs w:val="20"/>
-        </w:rPr>
-        <w:t>Strengthened</w:t>
-      </w:r>
-      <w:proofErr w:type="gramEnd"/>
-      <w:r>
-        <w:rPr>
-          <w:rStyle w:val="normaltextrun"/>
-          <w:rFonts w:ascii="Verdana" w:eastAsia="Arial" w:hAnsi="Verdana" w:cs="Arial"/>
-          <w:color w:val="000000" w:themeColor="text1"/>
-          <w:sz w:val="20"/>
-          <w:szCs w:val="20"/>
-        </w:rPr>
-        <w:t xml:space="preserve"> application security by enforcing encryption and secure coding standards</w:t>
+      <w:r>
+        <w:rPr>
+          <w:rStyle w:val="normaltextrun"/>
+          <w:rFonts w:ascii="Verdana" w:eastAsia="Arial" w:hAnsi="Verdana" w:cs="Arial"/>
+          <w:color w:val="000000" w:themeColor="text1"/>
+          <w:sz w:val="20"/>
+          <w:szCs w:val="20"/>
+        </w:rPr>
+        <w:t>Strengthened application security by enforcing encryption and secure coding standards</w:t>
       </w:r>
       <w:r>
         <w:rPr>
@@ -4591,7 +4162,6 @@
           <w:szCs w:val="20"/>
         </w:rPr>
       </w:pPr>
-      <w:proofErr w:type="spellStart"/>
       <w:r>
         <w:rPr>
           <w:rStyle w:val="contentcontrolboundarysink"/>
@@ -4602,20 +4172,7 @@
           <w:sz w:val="20"/>
           <w:szCs w:val="20"/>
         </w:rPr>
-        <w:t>Innominds</w:t>
-      </w:r>
-      <w:proofErr w:type="spellEnd"/>
-      <w:r>
-        <w:rPr>
-          <w:rStyle w:val="contentcontrolboundarysink"/>
-          <w:rFonts w:ascii="Verdana" w:hAnsi="Verdana" w:cs="Arial"/>
-          <w:b/>
-          <w:bCs/>
-          <w:color w:val="191919"/>
-          <w:sz w:val="20"/>
-          <w:szCs w:val="20"/>
-        </w:rPr>
-        <w:t>, San Jose, CA</w:t>
+        <w:t>Innominds, San Jose, CA</w:t>
       </w:r>
     </w:p>
     <w:p>
@@ -4797,29 +4354,7 @@
           <w:sz w:val="20"/>
           <w:szCs w:val="20"/>
         </w:rPr>
-        <w:t xml:space="preserve">Developed </w:t>
-      </w:r>
-      <w:proofErr w:type="spellStart"/>
-      <w:r>
-        <w:rPr>
-          <w:rStyle w:val="normaltextrun"/>
-          <w:rFonts w:ascii="Verdana" w:eastAsia="Arial" w:hAnsi="Verdana" w:cs="Arial"/>
-          <w:color w:val="000000" w:themeColor="text1"/>
-          <w:sz w:val="20"/>
-          <w:szCs w:val="20"/>
-        </w:rPr>
-        <w:t>AgileAsyncSWServices</w:t>
-      </w:r>
-      <w:proofErr w:type="spellEnd"/>
-      <w:r>
-        <w:rPr>
-          <w:rStyle w:val="normaltextrun"/>
-          <w:rFonts w:ascii="Verdana" w:eastAsia="Arial" w:hAnsi="Verdana" w:cs="Arial"/>
-          <w:color w:val="000000" w:themeColor="text1"/>
-          <w:sz w:val="20"/>
-          <w:szCs w:val="20"/>
-        </w:rPr>
-        <w:t xml:space="preserve"> (Tomcat/WebLogic) for real</w:t>
+        <w:t>Developed AgileAsyncSWServices (Tomcat/WebLogic) for real</w:t>
       </w:r>
       <w:r>
         <w:rPr>
@@ -4857,29 +4392,7 @@
           <w:sz w:val="20"/>
           <w:szCs w:val="20"/>
         </w:rPr>
-        <w:t>Automated daily cleanup (</w:t>
-      </w:r>
-      <w:proofErr w:type="spellStart"/>
-      <w:r>
-        <w:rPr>
-          <w:rStyle w:val="normaltextrun"/>
-          <w:rFonts w:ascii="Verdana" w:eastAsia="Arial" w:hAnsi="Verdana" w:cs="Arial"/>
-          <w:color w:val="000000" w:themeColor="text1"/>
-          <w:sz w:val="20"/>
-          <w:szCs w:val="20"/>
-        </w:rPr>
-        <w:t>UNCCleanup</w:t>
-      </w:r>
-      <w:proofErr w:type="spellEnd"/>
-      <w:r>
-        <w:rPr>
-          <w:rStyle w:val="normaltextrun"/>
-          <w:rFonts w:ascii="Verdana" w:eastAsia="Arial" w:hAnsi="Verdana" w:cs="Arial"/>
-          <w:color w:val="000000" w:themeColor="text1"/>
-          <w:sz w:val="20"/>
-          <w:szCs w:val="20"/>
-        </w:rPr>
-        <w:t>) jobs; integrated File Catalyst for accelerated data transfers.</w:t>
+        <w:t>Automated daily cleanup (UNCCleanup) jobs; integrated File Catalyst for accelerated data transfers.</w:t>
       </w:r>
     </w:p>
     <w:p>
@@ -4980,29 +4493,7 @@
           <w:sz w:val="20"/>
           <w:szCs w:val="20"/>
         </w:rPr>
-        <w:t xml:space="preserve">, enabling advanced file operations and mimicking </w:t>
-      </w:r>
-      <w:proofErr w:type="spellStart"/>
-      <w:r>
-        <w:rPr>
-          <w:rStyle w:val="normaltextrun"/>
-          <w:rFonts w:ascii="Verdana" w:eastAsia="Arial" w:hAnsi="Verdana" w:cs="Arial"/>
-          <w:color w:val="000000" w:themeColor="text1"/>
-          <w:sz w:val="20"/>
-          <w:szCs w:val="20"/>
-        </w:rPr>
-        <w:t>Agile’s</w:t>
-      </w:r>
-      <w:proofErr w:type="spellEnd"/>
-      <w:r>
-        <w:rPr>
-          <w:rStyle w:val="normaltextrun"/>
-          <w:rFonts w:ascii="Verdana" w:eastAsia="Arial" w:hAnsi="Verdana" w:cs="Arial"/>
-          <w:color w:val="000000" w:themeColor="text1"/>
-          <w:sz w:val="20"/>
-          <w:szCs w:val="20"/>
-        </w:rPr>
-        <w:t xml:space="preserve"> OOTB features, improving user experience by 20%.</w:t>
+        <w:t>, enabling advanced file operations and mimicking Agile’s OOTB features, improving user experience by 20%.</w:t>
       </w:r>
     </w:p>
     <w:p>
@@ -5275,7 +4766,6 @@
           <w:sz w:val="20"/>
           <w:szCs w:val="20"/>
         </w:rPr>
-        <w:lastRenderedPageBreak/>
         <w:t>Implemented Spring DI and transitioned EJBs to Spring</w:t>
       </w:r>
       <w:r>
@@ -5378,29 +4868,7 @@
           <w:sz w:val="20"/>
           <w:szCs w:val="20"/>
         </w:rPr>
-        <w:t xml:space="preserve">Authored XML SAX parsers/XSLT transformations; contributed to SOA web services; established performance testing with JMeter and coverage with </w:t>
-      </w:r>
-      <w:proofErr w:type="spellStart"/>
-      <w:r>
-        <w:rPr>
-          <w:rStyle w:val="normaltextrun"/>
-          <w:rFonts w:ascii="Verdana" w:eastAsia="Arial" w:hAnsi="Verdana" w:cs="Arial"/>
-          <w:color w:val="000000" w:themeColor="text1"/>
-          <w:sz w:val="20"/>
-          <w:szCs w:val="20"/>
-        </w:rPr>
-        <w:t>EclEmma</w:t>
-      </w:r>
-      <w:proofErr w:type="spellEnd"/>
-      <w:r>
-        <w:rPr>
-          <w:rStyle w:val="normaltextrun"/>
-          <w:rFonts w:ascii="Verdana" w:eastAsia="Arial" w:hAnsi="Verdana" w:cs="Arial"/>
-          <w:color w:val="000000" w:themeColor="text1"/>
-          <w:sz w:val="20"/>
-          <w:szCs w:val="20"/>
-        </w:rPr>
-        <w:t>.</w:t>
+        <w:t>Authored XML SAX parsers/XSLT transformations; contributed to SOA web services; established performance testing with JMeter and coverage with EclEmma.</w:t>
       </w:r>
     </w:p>
     <w:p>
@@ -5738,18 +5206,7 @@
           <w:sz w:val="20"/>
           <w:szCs w:val="20"/>
         </w:rPr>
-        <w:t xml:space="preserve">University, </w:t>
-      </w:r>
-      <w:proofErr w:type="gramStart"/>
-      <w:r>
-        <w:rPr>
-          <w:rStyle w:val="normaltextrun"/>
-          <w:rFonts w:ascii="Verdana" w:eastAsia="Arial" w:hAnsi="Verdana" w:cs="Arial"/>
-          <w:color w:val="000000" w:themeColor="text1"/>
-          <w:sz w:val="20"/>
-          <w:szCs w:val="20"/>
-        </w:rPr>
-        <w:t>M</w:t>
+        <w:t>University, M</w:t>
       </w:r>
       <w:r>
         <w:rPr>
@@ -5769,9 +5226,65 @@
           <w:sz w:val="20"/>
           <w:szCs w:val="20"/>
         </w:rPr>
-        <w:t>’s in Computer Applications</w:t>
-      </w:r>
-      <w:proofErr w:type="gramEnd"/>
+        <w:t xml:space="preserve">’s in Computer Applications </w:t>
+      </w:r>
+      <w:r>
+        <w:rPr>
+          <w:rStyle w:val="normaltextrun"/>
+          <w:rFonts w:ascii="Verdana" w:eastAsia="Arial" w:hAnsi="Verdana" w:cs="Arial"/>
+          <w:color w:val="000000" w:themeColor="text1"/>
+          <w:sz w:val="20"/>
+          <w:szCs w:val="20"/>
+        </w:rPr>
+        <w:t>​​20</w:t>
+      </w:r>
+      <w:r>
+        <w:rPr>
+          <w:rStyle w:val="normaltextrun"/>
+          <w:rFonts w:ascii="Verdana" w:eastAsia="Arial" w:hAnsi="Verdana" w:cs="Arial"/>
+          <w:color w:val="000000" w:themeColor="text1"/>
+          <w:sz w:val="20"/>
+          <w:szCs w:val="20"/>
+        </w:rPr>
+        <w:t>01</w:t>
+      </w:r>
+      <w:r>
+        <w:rPr>
+          <w:rStyle w:val="normaltextrun"/>
+          <w:rFonts w:ascii="Verdana" w:eastAsia="Arial" w:hAnsi="Verdana" w:cs="Arial"/>
+          <w:color w:val="000000" w:themeColor="text1"/>
+          <w:sz w:val="20"/>
+          <w:szCs w:val="20"/>
+        </w:rPr>
+        <w:t>​ </w:t>
+      </w:r>
+    </w:p>
+    <w:p>
+      <w:pPr>
+        <w:pStyle w:val="paragraph"/>
+        <w:numPr>
+          <w:ilvl w:val="0"/>
+          <w:numId w:val="6"/>
+        </w:numPr>
+        <w:spacing w:before="0" w:beforeAutospacing="0" w:after="0" w:afterAutospacing="0"/>
+        <w:rPr>
+          <w:rStyle w:val="normaltextrun"/>
+          <w:rFonts w:ascii="Verdana" w:eastAsia="Arial" w:hAnsi="Verdana" w:cs="Arial"/>
+          <w:color w:val="000000" w:themeColor="text1"/>
+          <w:sz w:val="20"/>
+          <w:szCs w:val="20"/>
+        </w:rPr>
+      </w:pPr>
+      <w:r>
+        <w:rPr>
+          <w:rStyle w:val="normaltextrun"/>
+          <w:rFonts w:ascii="Verdana" w:eastAsia="Arial" w:hAnsi="Verdana" w:cs="Arial"/>
+          <w:color w:val="000000" w:themeColor="text1"/>
+          <w:sz w:val="20"/>
+          <w:szCs w:val="20"/>
+        </w:rPr>
+        <w:t>Bachelor’s in Science - Mathematics</w:t>
+      </w:r>
       <w:r>
         <w:rPr>
           <w:rStyle w:val="normaltextrun"/>
@@ -5790,85 +5303,6 @@
           <w:sz w:val="20"/>
           <w:szCs w:val="20"/>
         </w:rPr>
-        <w:t>​​20</w:t>
-      </w:r>
-      <w:r>
-        <w:rPr>
-          <w:rStyle w:val="normaltextrun"/>
-          <w:rFonts w:ascii="Verdana" w:eastAsia="Arial" w:hAnsi="Verdana" w:cs="Arial"/>
-          <w:color w:val="000000" w:themeColor="text1"/>
-          <w:sz w:val="20"/>
-          <w:szCs w:val="20"/>
-        </w:rPr>
-        <w:t>01</w:t>
-      </w:r>
-      <w:r>
-        <w:rPr>
-          <w:rStyle w:val="normaltextrun"/>
-          <w:rFonts w:ascii="Verdana" w:eastAsia="Arial" w:hAnsi="Verdana" w:cs="Arial"/>
-          <w:color w:val="000000" w:themeColor="text1"/>
-          <w:sz w:val="20"/>
-          <w:szCs w:val="20"/>
-        </w:rPr>
-        <w:t>​ </w:t>
-      </w:r>
-    </w:p>
-    <w:p>
-      <w:pPr>
-        <w:pStyle w:val="paragraph"/>
-        <w:numPr>
-          <w:ilvl w:val="0"/>
-          <w:numId w:val="6"/>
-        </w:numPr>
-        <w:spacing w:before="0" w:beforeAutospacing="0" w:after="0" w:afterAutospacing="0"/>
-        <w:rPr>
-          <w:rStyle w:val="normaltextrun"/>
-          <w:rFonts w:ascii="Verdana" w:eastAsia="Arial" w:hAnsi="Verdana" w:cs="Arial"/>
-          <w:color w:val="000000" w:themeColor="text1"/>
-          <w:sz w:val="20"/>
-          <w:szCs w:val="20"/>
-        </w:rPr>
-      </w:pPr>
-      <w:proofErr w:type="gramStart"/>
-      <w:r>
-        <w:rPr>
-          <w:rStyle w:val="normaltextrun"/>
-          <w:rFonts w:ascii="Verdana" w:eastAsia="Arial" w:hAnsi="Verdana" w:cs="Arial"/>
-          <w:color w:val="000000" w:themeColor="text1"/>
-          <w:sz w:val="20"/>
-          <w:szCs w:val="20"/>
-        </w:rPr>
-        <w:t>Bachelor’s in Science</w:t>
-      </w:r>
-      <w:proofErr w:type="gramEnd"/>
-      <w:r>
-        <w:rPr>
-          <w:rStyle w:val="normaltextrun"/>
-          <w:rFonts w:ascii="Verdana" w:eastAsia="Arial" w:hAnsi="Verdana" w:cs="Arial"/>
-          <w:color w:val="000000" w:themeColor="text1"/>
-          <w:sz w:val="20"/>
-          <w:szCs w:val="20"/>
-        </w:rPr>
-        <w:t xml:space="preserve"> - Mathematics</w:t>
-      </w:r>
-      <w:r>
-        <w:rPr>
-          <w:rStyle w:val="normaltextrun"/>
-          <w:rFonts w:ascii="Verdana" w:eastAsia="Arial" w:hAnsi="Verdana" w:cs="Arial"/>
-          <w:color w:val="000000" w:themeColor="text1"/>
-          <w:sz w:val="20"/>
-          <w:szCs w:val="20"/>
-        </w:rPr>
-        <w:t xml:space="preserve"> </w:t>
-      </w:r>
-      <w:r>
-        <w:rPr>
-          <w:rStyle w:val="normaltextrun"/>
-          <w:rFonts w:ascii="Verdana" w:eastAsia="Arial" w:hAnsi="Verdana" w:cs="Arial"/>
-          <w:color w:val="000000" w:themeColor="text1"/>
-          <w:sz w:val="20"/>
-          <w:szCs w:val="20"/>
-        </w:rPr>
         <w:t xml:space="preserve">from Andhra University, </w:t>
       </w:r>
       <w:r>
@@ -5979,31 +5413,7 @@
           <w:szCs w:val="20"/>
           <w:lang w:val="fr-FR"/>
         </w:rPr>
-        <w:t xml:space="preserve">Oracle </w:t>
-      </w:r>
-      <w:proofErr w:type="spellStart"/>
-      <w:r>
-        <w:rPr>
-          <w:rStyle w:val="normaltextrun"/>
-          <w:rFonts w:ascii="Verdana" w:eastAsia="Arial" w:hAnsi="Verdana" w:cs="Arial"/>
-          <w:color w:val="000000" w:themeColor="text1"/>
-          <w:sz w:val="20"/>
-          <w:szCs w:val="20"/>
-          <w:lang w:val="fr-FR"/>
-        </w:rPr>
-        <w:t>Certified</w:t>
-      </w:r>
-      <w:proofErr w:type="spellEnd"/>
-      <w:r>
-        <w:rPr>
-          <w:rStyle w:val="normaltextrun"/>
-          <w:rFonts w:ascii="Verdana" w:eastAsia="Arial" w:hAnsi="Verdana" w:cs="Arial"/>
-          <w:color w:val="000000" w:themeColor="text1"/>
-          <w:sz w:val="20"/>
-          <w:szCs w:val="20"/>
-          <w:lang w:val="fr-FR"/>
-        </w:rPr>
-        <w:t xml:space="preserve"> Professional, Java SE Programmer</w:t>
+        <w:t>Oracle Certified Professional, Java SE Programmer</w:t>
       </w:r>
     </w:p>
     <w:p>
@@ -6082,6 +5492,7 @@
           <w:sz w:val="20"/>
           <w:szCs w:val="20"/>
         </w:rPr>
+        <w:lastRenderedPageBreak/>
         <w:t>Key Achievements</w:t>
       </w:r>
     </w:p>
@@ -6210,21 +5621,7 @@
         <w:rPr>
           <w:sz w:val="20"/>
         </w:rPr>
-        <w:t xml:space="preserve"> Automated 7-category GINR payment failure detection using Python/pandas </w:t>
-      </w:r>
-      <w:proofErr w:type="spellStart"/>
-      <w:r>
-        <w:rPr>
-          <w:sz w:val="20"/>
-        </w:rPr>
-        <w:t>APScheduler</w:t>
-      </w:r>
-      <w:proofErr w:type="spellEnd"/>
-      <w:r>
-        <w:rPr>
-          <w:sz w:val="20"/>
-        </w:rPr>
-        <w:t>, scanning 100+ records daily and replacing manual review — delivering actionable severity-prioritized reports to managers within minutes of the 7 AM CST run.</w:t>
+        <w:t xml:space="preserve"> Automated 7-category GINR payment failure detection using Python/pandas APScheduler, scanning 100+ records daily and replacing manual review — delivering actionable severity-prioritized reports to managers within minutes of the 7 AM CST run.</w:t>
       </w:r>
     </w:p>
     <w:p>

</xml_diff>